<commit_message>
docs: Add Mermaid code for UML diagrams
</commit_message>
<xml_diff>
--- a/documentation/Hire_Me_Comprehensive_Project_Report.docx
+++ b/documentation/Hire_Me_Comprehensive_Project_Report.docx
@@ -363,21 +363,548 @@
     <w:p>
       <w:r>
         <w:t>[INSERT USE CASE DIAGRAM HERE: Lead Architect - NDZI LEVI KONGNYU]</w:t>
+        <w:br/>
+        <w:br/>
+        <w:t>```mermaid</w:t>
+        <w:br/>
+        <w:t>usecaseDiagram</w:t>
+        <w:br/>
+        <w:t xml:space="preserve">    actor Client</w:t>
+        <w:br/>
+        <w:t xml:space="preserve">    actor Provider</w:t>
+        <w:br/>
+        <w:t xml:space="preserve">    actor Admin</w:t>
+        <w:br/>
+        <w:br/>
+        <w:t xml:space="preserve">    package "Hire Me Platform" {</w:t>
+        <w:br/>
+        <w:t xml:space="preserve">        usecase "Register &amp; Login" as UC1</w:t>
+        <w:br/>
+        <w:t xml:space="preserve">        usecase "Search Providers" as UC2</w:t>
+        <w:br/>
+        <w:t xml:space="preserve">        usecase "Book a Service" as UC3</w:t>
+        <w:br/>
+        <w:t xml:space="preserve">        usecase "Fund Wallet" as UC4</w:t>
+        <w:br/>
+        <w:t xml:space="preserve">        usecase "Chat with User" as UC5</w:t>
+        <w:br/>
+        <w:t xml:space="preserve">        usecase "Leave a Review" as UC6</w:t>
+        <w:br/>
+        <w:t xml:space="preserve">        usecase "Accept/Reject Booking" as UC7</w:t>
+        <w:br/>
+        <w:t xml:space="preserve">        usecase "Update Profile" as UC8</w:t>
+        <w:br/>
+        <w:t xml:space="preserve">        usecase "Verify Provider" as UC9</w:t>
+        <w:br/>
+        <w:t xml:space="preserve">        usecase "View Analytics" as UC10</w:t>
+        <w:br/>
+        <w:t xml:space="preserve">        usecase "Manage Disputes" as UC11</w:t>
+        <w:br/>
+        <w:t xml:space="preserve">    }</w:t>
+        <w:br/>
+        <w:br/>
+        <w:t xml:space="preserve">    Client --&gt; UC1</w:t>
+        <w:br/>
+        <w:t xml:space="preserve">    Client --&gt; UC2</w:t>
+        <w:br/>
+        <w:t xml:space="preserve">    Client --&gt; UC3</w:t>
+        <w:br/>
+        <w:t xml:space="preserve">    Client --&gt; UC4</w:t>
+        <w:br/>
+        <w:t xml:space="preserve">    Client --&gt; UC5</w:t>
+        <w:br/>
+        <w:t xml:space="preserve">    Client --&gt; UC6</w:t>
+        <w:br/>
+        <w:br/>
+        <w:t xml:space="preserve">    Provider --&gt; UC1</w:t>
+        <w:br/>
+        <w:t xml:space="preserve">    Provider --&gt; UC5</w:t>
+        <w:br/>
+        <w:t xml:space="preserve">    Provider --&gt; UC7</w:t>
+        <w:br/>
+        <w:t xml:space="preserve">    Provider --&gt; UC8</w:t>
+        <w:br/>
+        <w:br/>
+        <w:t xml:space="preserve">    Admin --&gt; UC1</w:t>
+        <w:br/>
+        <w:t xml:space="preserve">    Admin --&gt; UC9</w:t>
+        <w:br/>
+        <w:t xml:space="preserve">    Admin --&gt; UC10</w:t>
+        <w:br/>
+        <w:t xml:space="preserve">    Admin --&gt; UC11</w:t>
+        <w:br/>
+        <w:t>```</w:t>
+        <w:br/>
       </w:r>
     </w:p>
     <w:p>
       <w:r>
         <w:t>[INSERT CLASS DIAGRAM HERE: Lead Architect - NDZI LEVI KONGNYU]</w:t>
+        <w:br/>
+        <w:br/>
+        <w:t>```mermaid</w:t>
+        <w:br/>
+        <w:t>classDiagram</w:t>
+        <w:br/>
+        <w:t xml:space="preserve">    class UserController {</w:t>
+        <w:br/>
+        <w:t xml:space="preserve">        +getProfile(req, res)</w:t>
+        <w:br/>
+        <w:t xml:space="preserve">        +updateProfile(req, res)</w:t>
+        <w:br/>
+        <w:t xml:space="preserve">        +upgradeToProvider(req, res)</w:t>
+        <w:br/>
+        <w:t xml:space="preserve">    }</w:t>
+        <w:br/>
+        <w:t xml:space="preserve">    </w:t>
+        <w:br/>
+        <w:t xml:space="preserve">    class BookingController {</w:t>
+        <w:br/>
+        <w:t xml:space="preserve">        +createBooking(req, res)</w:t>
+        <w:br/>
+        <w:t xml:space="preserve">        +getBookings(req, res)</w:t>
+        <w:br/>
+        <w:t xml:space="preserve">        +updateBookingStatus(req, res)</w:t>
+        <w:br/>
+        <w:t xml:space="preserve">        +addReview(req, res)</w:t>
+        <w:br/>
+        <w:t xml:space="preserve">    }</w:t>
+        <w:br/>
+        <w:t xml:space="preserve">    </w:t>
+        <w:br/>
+        <w:t xml:space="preserve">    class BookingService {</w:t>
+        <w:br/>
+        <w:t xml:space="preserve">        +createBooking(clientId, data)</w:t>
+        <w:br/>
+        <w:t xml:space="preserve">        +getBookings(userId, role, options)</w:t>
+        <w:br/>
+        <w:t xml:space="preserve">        +updateBookingStatus(bookingId, status, userId, role)</w:t>
+        <w:br/>
+        <w:t xml:space="preserve">        +addReview(clientId, bookingId, data)</w:t>
+        <w:br/>
+        <w:t xml:space="preserve">    }</w:t>
+        <w:br/>
+        <w:t xml:space="preserve">    </w:t>
+        <w:br/>
+        <w:t xml:space="preserve">    class MessageService {</w:t>
+        <w:br/>
+        <w:t xml:space="preserve">        +getMessages(userId, bookingId)</w:t>
+        <w:br/>
+        <w:t xml:space="preserve">        +sendMessage(userId, bookingId, content)</w:t>
+        <w:br/>
+        <w:t xml:space="preserve">    }</w:t>
+        <w:br/>
+        <w:br/>
+        <w:t xml:space="preserve">    class User {</w:t>
+        <w:br/>
+        <w:t xml:space="preserve">        +id: Integer</w:t>
+        <w:br/>
+        <w:t xml:space="preserve">        +name: String</w:t>
+        <w:br/>
+        <w:t xml:space="preserve">        +wallet_balance: Decimal</w:t>
+        <w:br/>
+        <w:t xml:space="preserve">        +save()</w:t>
+        <w:br/>
+        <w:t xml:space="preserve">    }</w:t>
+        <w:br/>
+        <w:t xml:space="preserve">    </w:t>
+        <w:br/>
+        <w:t xml:space="preserve">    class Booking {</w:t>
+        <w:br/>
+        <w:t xml:space="preserve">        +id: Integer</w:t>
+        <w:br/>
+        <w:t xml:space="preserve">        +status: Enum</w:t>
+        <w:br/>
+        <w:t xml:space="preserve">        +save()</w:t>
+        <w:br/>
+        <w:t xml:space="preserve">    }</w:t>
+        <w:br/>
+        <w:br/>
+        <w:t xml:space="preserve">    UserController --&gt; User : "manages"</w:t>
+        <w:br/>
+        <w:t xml:space="preserve">    BookingController --&gt; BookingService : "delegates to"</w:t>
+        <w:br/>
+        <w:t xml:space="preserve">    BookingService --&gt; Booking : "mutates"</w:t>
+        <w:br/>
+        <w:t xml:space="preserve">    BookingService --&gt; User : "mutates wallet"</w:t>
+        <w:br/>
+        <w:t>```</w:t>
+        <w:br/>
       </w:r>
     </w:p>
     <w:p>
       <w:r>
-        <w:t>[INSERT SEQUENCE DIAGRAM HERE: Lead Architect - NDZI LEVI KONGNYU]</w:t>
+        <w:t>[INSERT SEQUENCE DIAGRAMS HERE: Lead Architect - NDZI LEVI KONGNYU]</w:t>
+        <w:br/>
+        <w:br/>
+        <w:t>1. Authentication Flow</w:t>
+        <w:br/>
+        <w:t>```mermaid</w:t>
+        <w:br/>
+        <w:t>sequenceDiagram</w:t>
+        <w:br/>
+        <w:t xml:space="preserve">    participant User as Client/App</w:t>
+        <w:br/>
+        <w:t xml:space="preserve">    participant AuthCtrl as AuthController</w:t>
+        <w:br/>
+        <w:t xml:space="preserve">    participant UserSvc as UserService</w:t>
+        <w:br/>
+        <w:t xml:space="preserve">    participant DB as Database</w:t>
+        <w:br/>
+        <w:t xml:space="preserve">    </w:t>
+        <w:br/>
+        <w:t xml:space="preserve">    User-&gt;&gt;AuthCtrl: POST /api/auth/login {email, password}</w:t>
+        <w:br/>
+        <w:t xml:space="preserve">    AuthCtrl-&gt;&gt;UserSvc: loginUser(email, password)</w:t>
+        <w:br/>
+        <w:t xml:space="preserve">    UserSvc-&gt;&gt;DB: findOne({email})</w:t>
+        <w:br/>
+        <w:t xml:space="preserve">    DB--&gt;&gt;UserSvc: User Record</w:t>
+        <w:br/>
+        <w:t xml:space="preserve">    UserSvc-&gt;&gt;UserSvc: bcrypt.compare(password, hash)</w:t>
+        <w:br/>
+        <w:t xml:space="preserve">    UserSvc-&gt;&gt;UserSvc: jwt.sign(payload, secret)</w:t>
+        <w:br/>
+        <w:t xml:space="preserve">    UserSvc--&gt;&gt;AuthCtrl: token, user</w:t>
+        <w:br/>
+        <w:t xml:space="preserve">    AuthCtrl--&gt;&gt;User: 200 OK {token, user}</w:t>
+        <w:br/>
+        <w:t>```</w:t>
+        <w:br/>
+        <w:br/>
+        <w:t>2. Booking &amp; Escrow Flow</w:t>
+        <w:br/>
+        <w:t>```mermaid</w:t>
+        <w:br/>
+        <w:t>sequenceDiagram</w:t>
+        <w:br/>
+        <w:t xml:space="preserve">    participant Client</w:t>
+        <w:br/>
+        <w:t xml:space="preserve">    participant BookingSvc as BookingService</w:t>
+        <w:br/>
+        <w:t xml:space="preserve">    participant DB as Database</w:t>
+        <w:br/>
+        <w:t xml:space="preserve">    participant Socket as Socket.io Server</w:t>
+        <w:br/>
+        <w:t xml:space="preserve">    participant Provider</w:t>
+        <w:br/>
+        <w:t xml:space="preserve">    </w:t>
+        <w:br/>
+        <w:t xml:space="preserve">    Client-&gt;&gt;BookingSvc: createBooking(providerId, date, hours)</w:t>
+        <w:br/>
+        <w:t xml:space="preserve">    BookingSvc-&gt;&gt;DB: findByPk(providerId)</w:t>
+        <w:br/>
+        <w:t xml:space="preserve">    DB--&gt;&gt;BookingSvc: Provider Profile (rate = 5000)</w:t>
+        <w:br/>
+        <w:t xml:space="preserve">    BookingSvc-&gt;&gt;DB: findByPk(clientId)</w:t>
+        <w:br/>
+        <w:t xml:space="preserve">    DB--&gt;&gt;BookingSvc: Client User (wallet = 10000)</w:t>
+        <w:br/>
+        <w:t xml:space="preserve">    BookingSvc-&gt;&gt;BookingSvc: Calculate Fee (5000 * hours)</w:t>
+        <w:br/>
+        <w:t xml:space="preserve">    BookingSvc-&gt;&gt;DB: Deduct Fee from Client Wallet</w:t>
+        <w:br/>
+        <w:t xml:space="preserve">    BookingSvc-&gt;&gt;DB: Create Transaction (ESCROW_HOLD)</w:t>
+        <w:br/>
+        <w:t xml:space="preserve">    BookingSvc-&gt;&gt;DB: Create Booking (status: PENDING)</w:t>
+        <w:br/>
+        <w:t xml:space="preserve">    BookingSvc--&gt;&gt;Client: 201 Created (Booking ID)</w:t>
+        <w:br/>
+        <w:t xml:space="preserve">    BookingSvc-&gt;&gt;Socket: emit('new_booking', {bookingId})</w:t>
+        <w:br/>
+        <w:t xml:space="preserve">    Socket--&gt;&gt;Provider: Real-time Notification</w:t>
+        <w:br/>
+        <w:t>```</w:t>
+        <w:br/>
+        <w:br/>
+        <w:t>3. Job Completion Flow</w:t>
+        <w:br/>
+        <w:t>```mermaid</w:t>
+        <w:br/>
+        <w:t>sequenceDiagram</w:t>
+        <w:br/>
+        <w:t xml:space="preserve">    participant Client</w:t>
+        <w:br/>
+        <w:t xml:space="preserve">    participant BookingSvc as BookingService</w:t>
+        <w:br/>
+        <w:t xml:space="preserve">    participant DB as Database</w:t>
+        <w:br/>
+        <w:t xml:space="preserve">    </w:t>
+        <w:br/>
+        <w:t xml:space="preserve">    Client-&gt;&gt;BookingSvc: updateBookingStatus(bookingId, 'COMPLETED')</w:t>
+        <w:br/>
+        <w:t xml:space="preserve">    BookingSvc-&gt;&gt;DB: findByPk(bookingId)</w:t>
+        <w:br/>
+        <w:t xml:space="preserve">    DB--&gt;&gt;BookingSvc: Booking (status: ACCEPTED)</w:t>
+        <w:br/>
+        <w:t xml:space="preserve">    BookingSvc-&gt;&gt;BookingSvc: Calculate Fee (e.g., 10000)</w:t>
+        <w:br/>
+        <w:t xml:space="preserve">    BookingSvc-&gt;&gt;BookingSvc: Platform Fee (5% = 500)</w:t>
+        <w:br/>
+        <w:t xml:space="preserve">    BookingSvc-&gt;&gt;BookingSvc: Payout (95% = 9500)</w:t>
+        <w:br/>
+        <w:t xml:space="preserve">    BookingSvc-&gt;&gt;DB: Add Payout to Provider Wallet</w:t>
+        <w:br/>
+        <w:t xml:space="preserve">    BookingSvc-&gt;&gt;DB: Create Transactions</w:t>
+        <w:br/>
+        <w:t xml:space="preserve">    BookingSvc-&gt;&gt;DB: Update Booking (COMPLETED)</w:t>
+        <w:br/>
+        <w:t xml:space="preserve">    BookingSvc--&gt;&gt;Client: 200 OK</w:t>
+        <w:br/>
+        <w:t>```</w:t>
+        <w:br/>
+        <w:br/>
+        <w:t>4. Real-Time Chat</w:t>
+        <w:br/>
+        <w:t>```mermaid</w:t>
+        <w:br/>
+        <w:t>sequenceDiagram</w:t>
+        <w:br/>
+        <w:t xml:space="preserve">    participant Client</w:t>
+        <w:br/>
+        <w:t xml:space="preserve">    participant MsgSvc as MessageService</w:t>
+        <w:br/>
+        <w:t xml:space="preserve">    participant DB as Database</w:t>
+        <w:br/>
+        <w:t xml:space="preserve">    participant Socket as Socket.io Server</w:t>
+        <w:br/>
+        <w:t xml:space="preserve">    participant Provider</w:t>
+        <w:br/>
+        <w:t xml:space="preserve">    </w:t>
+        <w:br/>
+        <w:t xml:space="preserve">    Client-&gt;&gt;MsgSvc: sendMessage(bookingId, "Hello")</w:t>
+        <w:br/>
+        <w:t xml:space="preserve">    MsgSvc-&gt;&gt;DB: Message.create({content})</w:t>
+        <w:br/>
+        <w:t xml:space="preserve">    DB--&gt;&gt;MsgSvc: New Message</w:t>
+        <w:br/>
+        <w:t xml:space="preserve">    MsgSvc-&gt;&gt;Socket: emit('new_message', Full Message)</w:t>
+        <w:br/>
+        <w:t xml:space="preserve">    Socket--&gt;&gt;Provider: Update Chat UI</w:t>
+        <w:br/>
+        <w:t>```</w:t>
+        <w:br/>
+        <w:br/>
+        <w:t>5. Booking Cancellation</w:t>
+        <w:br/>
+        <w:t>```mermaid</w:t>
+        <w:br/>
+        <w:t>sequenceDiagram</w:t>
+        <w:br/>
+        <w:t xml:space="preserve">    participant Client</w:t>
+        <w:br/>
+        <w:t xml:space="preserve">    participant BookingSvc as BookingService</w:t>
+        <w:br/>
+        <w:t xml:space="preserve">    participant DB as Database</w:t>
+        <w:br/>
+        <w:t xml:space="preserve">    </w:t>
+        <w:br/>
+        <w:t xml:space="preserve">    Client-&gt;&gt;BookingSvc: updateBookingStatus(bookingId, 'CANCELLED')</w:t>
+        <w:br/>
+        <w:t xml:space="preserve">    BookingSvc-&gt;&gt;DB: Add Fee back to Client Wallet</w:t>
+        <w:br/>
+        <w:t xml:space="preserve">    BookingSvc-&gt;&gt;DB: Create Transaction (ESCROW_REFUND)</w:t>
+        <w:br/>
+        <w:t xml:space="preserve">    BookingSvc-&gt;&gt;DB: Update Booking (status: CANCELLED)</w:t>
+        <w:br/>
+        <w:t xml:space="preserve">    BookingSvc--&gt;&gt;Client: 200 OK (Refund Processed)</w:t>
+        <w:br/>
+        <w:t>```</w:t>
+        <w:br/>
       </w:r>
     </w:p>
     <w:p>
       <w:r>
         <w:t>[INSERT ENTITY-RELATIONSHIP DIAGRAM (ERD) HERE: Lead Architect - NDZI LEVI KONGNYU]</w:t>
+        <w:br/>
+        <w:br/>
+        <w:t>```mermaid</w:t>
+        <w:br/>
+        <w:t>erDiagram</w:t>
+        <w:br/>
+        <w:t xml:space="preserve">    USER ||--o{ BOOKING : "creates (as client)"</w:t>
+        <w:br/>
+        <w:t xml:space="preserve">    USER ||--o{ PROVIDER_PROFILE : "has one"</w:t>
+        <w:br/>
+        <w:t xml:space="preserve">    USER ||--o{ TRANSACTION : "makes"</w:t>
+        <w:br/>
+        <w:t xml:space="preserve">    USER ||--o{ MESSAGE : "sends"</w:t>
+        <w:br/>
+        <w:t xml:space="preserve">    USER }|--|{ PROVIDER_PROFILE : "saves (SavedProvider)"</w:t>
+        <w:br/>
+        <w:t xml:space="preserve">    </w:t>
+        <w:br/>
+        <w:t xml:space="preserve">    PROVIDER_PROFILE ||--o{ BOOKING : "receives"</w:t>
+        <w:br/>
+        <w:t xml:space="preserve">    </w:t>
+        <w:br/>
+        <w:t xml:space="preserve">    BOOKING ||--o{ MESSAGE : "contains"</w:t>
+        <w:br/>
+        <w:t xml:space="preserve">    </w:t>
+        <w:br/>
+        <w:t xml:space="preserve">    USER {</w:t>
+        <w:br/>
+        <w:t xml:space="preserve">        int id PK</w:t>
+        <w:br/>
+        <w:t xml:space="preserve">        string name</w:t>
+        <w:br/>
+        <w:t xml:space="preserve">        string email</w:t>
+        <w:br/>
+        <w:t xml:space="preserve">        string password_hash</w:t>
+        <w:br/>
+        <w:t xml:space="preserve">        enum role</w:t>
+        <w:br/>
+        <w:t xml:space="preserve">        decimal wallet_balance</w:t>
+        <w:br/>
+        <w:t xml:space="preserve">    }</w:t>
+        <w:br/>
+        <w:t xml:space="preserve">    </w:t>
+        <w:br/>
+        <w:t xml:space="preserve">    PROVIDER_PROFILE {</w:t>
+        <w:br/>
+        <w:t xml:space="preserve">        int id PK</w:t>
+        <w:br/>
+        <w:t xml:space="preserve">        int user_id FK</w:t>
+        <w:br/>
+        <w:t xml:space="preserve">        string trade</w:t>
+        <w:br/>
+        <w:t xml:space="preserve">        decimal hourly_rate</w:t>
+        <w:br/>
+        <w:t xml:space="preserve">        string bio</w:t>
+        <w:br/>
+        <w:t xml:space="preserve">        boolean is_verified</w:t>
+        <w:br/>
+        <w:t xml:space="preserve">        decimal rating</w:t>
+        <w:br/>
+        <w:t xml:space="preserve">    }</w:t>
+        <w:br/>
+        <w:t xml:space="preserve">    </w:t>
+        <w:br/>
+        <w:t xml:space="preserve">    BOOKING {</w:t>
+        <w:br/>
+        <w:t xml:space="preserve">        int id PK</w:t>
+        <w:br/>
+        <w:t xml:space="preserve">        int client_id FK</w:t>
+        <w:br/>
+        <w:t xml:space="preserve">        int provider_id FK</w:t>
+        <w:br/>
+        <w:t xml:space="preserve">        datetime job_date</w:t>
+        <w:br/>
+        <w:t xml:space="preserve">        enum status</w:t>
+        <w:br/>
+        <w:t xml:space="preserve">        int estimated_hours</w:t>
+        <w:br/>
+        <w:t xml:space="preserve">        decimal rating</w:t>
+        <w:br/>
+        <w:t xml:space="preserve">    }</w:t>
+        <w:br/>
+        <w:t xml:space="preserve">    </w:t>
+        <w:br/>
+        <w:t xml:space="preserve">    TRANSACTION {</w:t>
+        <w:br/>
+        <w:t xml:space="preserve">        int id PK</w:t>
+        <w:br/>
+        <w:t xml:space="preserve">        int user_id FK</w:t>
+        <w:br/>
+        <w:t xml:space="preserve">        decimal amount</w:t>
+        <w:br/>
+        <w:t xml:space="preserve">        enum type</w:t>
+        <w:br/>
+        <w:t xml:space="preserve">        enum status</w:t>
+        <w:br/>
+        <w:t xml:space="preserve">    }</w:t>
+        <w:br/>
+        <w:t xml:space="preserve">    </w:t>
+        <w:br/>
+        <w:t xml:space="preserve">    MESSAGE {</w:t>
+        <w:br/>
+        <w:t xml:space="preserve">        int id PK</w:t>
+        <w:br/>
+        <w:t xml:space="preserve">        int booking_id FK</w:t>
+        <w:br/>
+        <w:t xml:space="preserve">        int sender_id FK</w:t>
+        <w:br/>
+        <w:t xml:space="preserve">        string content</w:t>
+        <w:br/>
+        <w:t xml:space="preserve">    }</w:t>
+        <w:br/>
+        <w:t>```</w:t>
+        <w:br/>
+        <w:br/>
+        <w:t>[INSERT OBJECT DIAGRAM HERE: Lead Architect - NDZI LEVI KONGNYU]</w:t>
+        <w:br/>
+        <w:br/>
+        <w:t>```mermaid</w:t>
+        <w:br/>
+        <w:t>classDiagram</w:t>
+        <w:br/>
+        <w:t xml:space="preserve">    object ClientUser {</w:t>
+        <w:br/>
+        <w:t xml:space="preserve">        id = 101</w:t>
+        <w:br/>
+        <w:t xml:space="preserve">        name = "Franck Ateba"</w:t>
+        <w:br/>
+        <w:t xml:space="preserve">        role = "CLIENT"</w:t>
+        <w:br/>
+        <w:t xml:space="preserve">        wallet_balance = 45000</w:t>
+        <w:br/>
+        <w:t xml:space="preserve">    }</w:t>
+        <w:br/>
+        <w:t xml:space="preserve">    </w:t>
+        <w:br/>
+        <w:t xml:space="preserve">    object ProviderUser {</w:t>
+        <w:br/>
+        <w:t xml:space="preserve">        id = 202</w:t>
+        <w:br/>
+        <w:t xml:space="preserve">        name = "Samuel Eto"</w:t>
+        <w:br/>
+        <w:t xml:space="preserve">        role = "PROVIDER"</w:t>
+        <w:br/>
+        <w:t xml:space="preserve">        wallet_balance = 120000</w:t>
+        <w:br/>
+        <w:t xml:space="preserve">    }</w:t>
+        <w:br/>
+        <w:t xml:space="preserve">    </w:t>
+        <w:br/>
+        <w:t xml:space="preserve">    object PlumberProfile {</w:t>
+        <w:br/>
+        <w:t xml:space="preserve">        id = 5</w:t>
+        <w:br/>
+        <w:t xml:space="preserve">        user_id = 202</w:t>
+        <w:br/>
+        <w:t xml:space="preserve">        trade = "Plumber"</w:t>
+        <w:br/>
+        <w:t xml:space="preserve">        hourly_rate = 7500</w:t>
+        <w:br/>
+        <w:t xml:space="preserve">        is_verified = true</w:t>
+        <w:br/>
+        <w:t xml:space="preserve">    }</w:t>
+        <w:br/>
+        <w:t xml:space="preserve">    </w:t>
+        <w:br/>
+        <w:t xml:space="preserve">    object ActiveBooking {</w:t>
+        <w:br/>
+        <w:t xml:space="preserve">        id = 12</w:t>
+        <w:br/>
+        <w:t xml:space="preserve">        client_id = 101</w:t>
+        <w:br/>
+        <w:t xml:space="preserve">        provider_id = 5</w:t>
+        <w:br/>
+        <w:t xml:space="preserve">        status = "ACCEPTED"</w:t>
+        <w:br/>
+        <w:t xml:space="preserve">        estimated_hours = 2</w:t>
+        <w:br/>
+        <w:t xml:space="preserve">    }</w:t>
+        <w:br/>
+        <w:br/>
+        <w:t xml:space="preserve">    ClientUser -- ActiveBooking : "client_id"</w:t>
+        <w:br/>
+        <w:t xml:space="preserve">    ActiveBooking -- PlumberProfile : "provider_id"</w:t>
+        <w:br/>
+        <w:t xml:space="preserve">    PlumberProfile -- ProviderUser : "user_id"</w:t>
+        <w:br/>
+        <w:t>```</w:t>
+        <w:br/>
       </w:r>
     </w:p>
     <w:p>

</xml_diff>

<commit_message>
docs: Safely inject missing academic sections into the main report
</commit_message>
<xml_diff>
--- a/documentation/Hire_Me_Comprehensive_Project_Report.docx
+++ b/documentation/Hire_Me_Comprehensive_Project_Report.docx
@@ -350,6 +350,32 @@
       </w:pPr>
       <w:r>
         <w:t>Clear Role Distribution: With a clear division of labor across frontend, backend, and documentation, the Scrum framework provided necessary structure. The Product Backlog ensured that all contributors remained aligned on priority tasks, preventing scope creep.</w:t>
+      </w:r>
+    </w:p>
+    <w:p>
+      <w:pPr>
+        <w:pStyle w:val="Titre2"/>
+      </w:pPr>
+      <w:r>
+        <w:t>2.4 Comparison between different Software Development Methodologies</w:t>
+      </w:r>
+    </w:p>
+    <w:p>
+      <w:r>
+        <w:t>The Waterfall methodology is highly structured and requires extensive upfront documentation; however, it lacks flexibility if requirements change mid-development. In contrast, Agile methodologies (like Scrum) prioritize adaptability, continuous delivery, and cross-functional team collaboration, allowing for rapid adjustments based on continuous testing and feedback. While Waterfall is suited for systems with rigid, unchanging requirements, Agile is superior for modern web applications that evolve dynamically.</w:t>
+      </w:r>
+    </w:p>
+    <w:p>
+      <w:pPr>
+        <w:pStyle w:val="Titre2"/>
+      </w:pPr>
+      <w:r>
+        <w:t>2.5 General review of related concepts</w:t>
+      </w:r>
+    </w:p>
+    <w:p>
+      <w:r>
+        <w:t>Key concepts related to our platform include Escrow Financial Logic (holding funds in a neutral third-party state until conditions are met), Single Page Application (SPA) architecture for fluid user experiences without page reloads, and WebSocket protocols for persistent, bi-directional real-time communication without HTTP polling overhead.</w:t>
       </w:r>
     </w:p>
     <w:p>
@@ -999,6 +1025,149 @@
     <w:p/>
     <w:p>
       <w:pPr>
+        <w:pStyle w:val="Titre2"/>
+      </w:pPr>
+      <w:r>
+        <w:t>3.3 Research Methodology</w:t>
+      </w:r>
+    </w:p>
+    <w:p>
+      <w:r>
+        <w:t>This project employed an iterative, applied research methodology combined with Agile Scrum practices. We conducted a preliminary analysis of existing market solutions, identified the technological requirements necessary for a real-time marketplace, and iteratively developed the software through continuous integration and peer testing.</w:t>
+      </w:r>
+    </w:p>
+    <w:p>
+      <w:pPr>
+        <w:pStyle w:val="Titre2"/>
+      </w:pPr>
+      <w:r>
+        <w:t>3.4 System Requirements (Functional and Non-Functional)</w:t>
+      </w:r>
+    </w:p>
+    <w:p>
+      <w:r>
+        <w:t>Functional Requirements: The system must allow users to register as Clients or Providers. The system must process Escrow hold transactions. The system must support real-time chat messaging. Admins must be able to verify provider IDs.\nNon-Functional Requirements: The system must hash passwords using bcrypt. The frontend must be fully responsive (mobile-first). The API must return responses in under 500ms.</w:t>
+      </w:r>
+    </w:p>
+    <w:p>
+      <w:pPr>
+        <w:pStyle w:val="Titre2"/>
+      </w:pPr>
+      <w:r>
+        <w:t>3.5 System Architecture (HLD)</w:t>
+      </w:r>
+    </w:p>
+    <w:p>
+      <w:r>
+        <w:t>The "Hire Me" platform utilizes a modern Client-Server architecture. The Presentation Layer is a React.js SPA, ensuring a dynamic UI. The Application Layer is powered by a Node.js/Express server handling business logic and Socket.io for WebSockets. The Data Layer is managed via Sequelize ORM interacting with an SQLite database (adaptable to PostgreSQL for production).</w:t>
+      </w:r>
+    </w:p>
+    <w:p>
+      <w:pPr>
+        <w:pStyle w:val="Titre2"/>
+      </w:pPr>
+      <w:r>
+        <w:t>3.6 Application of Scrum</w:t>
+      </w:r>
+    </w:p>
+    <w:p>
+      <w:r>
+        <w:t>Scrum was applied by defining a comprehensive Product Backlog prior to development. The project was segmented into 4 one-week Sprints. We utilized GitHub as our central integration artifact and WhatsApp for asynchronous Daily Stand-ups. Each Sprint concluded with a Sprint Review where branches were merged and tested.</w:t>
+      </w:r>
+    </w:p>
+    <w:p>
+      <w:pPr>
+        <w:pStyle w:val="Titre2"/>
+      </w:pPr>
+      <w:r>
+        <w:t>3.7 Team organization and Workflow</w:t>
+      </w:r>
+    </w:p>
+    <w:p>
+      <w:r>
+        <w:t>The team operated with strict Role-Based isolation: EBUA KEDZE FRANCK JORDAN (Scrum Master &amp; Backend Lead) managed DBs and merges. AWONO FABIEN NYADINGA (Frontend Lead) directed React UI. Besomba Baonerges (Systems Analyst) authored requirements documents. NDZI LEVI KONGNYU (QA &amp; UML Architect) designed structural diagrams and testing.</w:t>
+      </w:r>
+    </w:p>
+    <w:p>
+      <w:pPr>
+        <w:pStyle w:val="Titre2"/>
+      </w:pPr>
+      <w:r>
+        <w:t>3.8 Conflict Resolution</w:t>
+      </w:r>
+    </w:p>
+    <w:p>
+      <w:r>
+        <w:t>Technical conflicts, such as Git merge conflicts or CORS issues between the frontend and backend, were flagged immediately during the WhatsApp Daily Stand-ups. The Scrum Master facilitated screen-sharing sessions to resolve integration blockers, ensuring the master branch remained stable.</w:t>
+      </w:r>
+    </w:p>
+    <w:p>
+      <w:pPr>
+        <w:pStyle w:val="Titre2"/>
+      </w:pPr>
+      <w:r>
+        <w:t>3.9 Challenges encounter and how you overcame them</w:t>
+      </w:r>
+    </w:p>
+    <w:p>
+      <w:r>
+        <w:t>A major challenge was the asynchronous nature of JavaScript resulting in duplicate Socket.io chat messages. This was overcome by refactoring the React useEffect hooks to properly clean up socket listeners on component unmount. Another challenge was the escrow financial calculation, which we solved by centralizing all financial logic into a secure, encapsulated Backend Service class.</w:t>
+      </w:r>
+    </w:p>
+    <w:p>
+      <w:pPr>
+        <w:pStyle w:val="Titre2"/>
+      </w:pPr>
+      <w:r>
+        <w:t>3.10 Scrum Artifacts &amp; Test Case Document</w:t>
+      </w:r>
+    </w:p>
+    <w:p>
+      <w:r>
+        <w:t>[PLACEHOLDER: Insert screenshots or tables of the Sprint Backlogs and the QA Test Case Matrix here]</w:t>
+      </w:r>
+    </w:p>
+    <w:p>
+      <w:pPr>
+        <w:pStyle w:val="Titre2"/>
+      </w:pPr>
+      <w:r>
+        <w:t>3.11 Proposed Algorithms</w:t>
+      </w:r>
+    </w:p>
+    <w:p>
+      <w:r>
+        <w:t>1. Escrow Algorithm: Upon booking, Client Wallet is decremented. Upon completion, Provider Wallet is incremented by 95% of the fee, and Platform Wallet by 5%.\n2. Provider Search: A filtering algorithm that queries the database matching the requested trade, ensuring hourly_rate &lt;= max_rate, and is_verified == true, sorting by descending rating.</w:t>
+      </w:r>
+    </w:p>
+    <w:p>
+      <w:pPr>
+        <w:pStyle w:val="Titre2"/>
+      </w:pPr>
+      <w:r>
+        <w:t>3.12 Materials and technologies used</w:t>
+      </w:r>
+    </w:p>
+    <w:p>
+      <w:r>
+        <w:t>React.js (Frontend), Tailwind CSS (Styling), Node.js/Express.js (Backend), Sequelize/SQLite (Database), Socket.io (WebSockets), Jest (Testing).</w:t>
+      </w:r>
+    </w:p>
+    <w:p>
+      <w:pPr>
+        <w:pStyle w:val="Titre2"/>
+      </w:pPr>
+      <w:r>
+        <w:t>Results and API Testing</w:t>
+      </w:r>
+    </w:p>
+    <w:p>
+      <w:r>
+        <w:t>[PLACEHOLDER: Insert Screenshots of various API Request/Response from Postman here]</w:t>
+      </w:r>
+    </w:p>
+    <w:p>
+      <w:pPr>
         <w:pStyle w:val="Titre1"/>
       </w:pPr>
       <w:r>

</xml_diff>

<commit_message>
docs: Embed native Word tables for Sprint Backlogs and QA Matrix
</commit_message>
<xml_diff>
--- a/documentation/Hire_Me_Comprehensive_Project_Report.docx
+++ b/documentation/Hire_Me_Comprehensive_Project_Report.docx
@@ -1080,6 +1080,7 @@
         <w:pStyle w:val="Titre2"/>
       </w:pPr>
       <w:r>
+        <w:lastRenderedPageBreak/>
         <w:t>3.7 Team organization and Workflow</w:t>
       </w:r>
     </w:p>
@@ -1123,10 +1124,555 @@
       </w:r>
     </w:p>
     <w:p>
+      <w:r/>
+    </w:p>
+    <w:p>
+      <w:pPr>
+        <w:pStyle w:val="Titre3"/>
+      </w:pPr>
       <w:r>
-        <w:t>[PLACEHOLDER: Insert screenshots or tables of the Sprint Backlogs and the QA Test Case Matrix here]</w:t>
+        <w:t>Sprint 1: Architecture &amp; Auth</w:t>
       </w:r>
     </w:p>
+    <w:tbl>
+      <w:tblPr>
+        <w:tblStyle w:val="Grilledutableau"/>
+        <w:tblW w:type="auto" w:w="0"/>
+        <w:tblLook w:firstColumn="1" w:firstRow="1" w:lastColumn="0" w:lastRow="0" w:noHBand="0" w:noVBand="1" w:val="04A0"/>
+      </w:tblPr>
+      <w:tblGrid>
+        <w:gridCol w:w="2160"/>
+        <w:gridCol w:w="2160"/>
+        <w:gridCol w:w="2160"/>
+        <w:gridCol w:w="2160"/>
+      </w:tblGrid>
+      <w:tr>
+        <w:tc>
+          <w:tcPr>
+            <w:tcW w:type="dxa" w:w="2160"/>
+          </w:tcPr>
+          <w:p>
+            <w:r>
+              <w:t>Ticket ID</w:t>
+            </w:r>
+          </w:p>
+        </w:tc>
+        <w:tc>
+          <w:tcPr>
+            <w:tcW w:type="dxa" w:w="2160"/>
+          </w:tcPr>
+          <w:p>
+            <w:r>
+              <w:t>Task</w:t>
+            </w:r>
+          </w:p>
+        </w:tc>
+        <w:tc>
+          <w:tcPr>
+            <w:tcW w:type="dxa" w:w="2160"/>
+          </w:tcPr>
+          <w:p>
+            <w:r>
+              <w:t>Assignee</w:t>
+            </w:r>
+          </w:p>
+        </w:tc>
+        <w:tc>
+          <w:tcPr>
+            <w:tcW w:type="dxa" w:w="2160"/>
+          </w:tcPr>
+          <w:p>
+            <w:r>
+              <w:t>Status</w:t>
+            </w:r>
+          </w:p>
+        </w:tc>
+      </w:tr>
+      <w:tr>
+        <w:tc>
+          <w:tcPr>
+            <w:tcW w:type="dxa" w:w="2160"/>
+          </w:tcPr>
+          <w:p>
+            <w:r>
+              <w:t>TKT-101</w:t>
+            </w:r>
+          </w:p>
+        </w:tc>
+        <w:tc>
+          <w:tcPr>
+            <w:tcW w:type="dxa" w:w="2160"/>
+          </w:tcPr>
+          <w:p>
+            <w:r>
+              <w:t>Init Node.js + Express backend</w:t>
+            </w:r>
+          </w:p>
+        </w:tc>
+        <w:tc>
+          <w:tcPr>
+            <w:tcW w:type="dxa" w:w="2160"/>
+          </w:tcPr>
+          <w:p>
+            <w:r>
+              <w:t>EBUA KEDZE FRANCK JORDAN</w:t>
+            </w:r>
+          </w:p>
+        </w:tc>
+        <w:tc>
+          <w:tcPr>
+            <w:tcW w:type="dxa" w:w="2160"/>
+          </w:tcPr>
+          <w:p>
+            <w:r>
+              <w:t>Done</w:t>
+            </w:r>
+          </w:p>
+        </w:tc>
+      </w:tr>
+      <w:tr>
+        <w:tc>
+          <w:tcPr>
+            <w:tcW w:type="dxa" w:w="2160"/>
+          </w:tcPr>
+          <w:p>
+            <w:r>
+              <w:t>TKT-102</w:t>
+            </w:r>
+          </w:p>
+        </w:tc>
+        <w:tc>
+          <w:tcPr>
+            <w:tcW w:type="dxa" w:w="2160"/>
+          </w:tcPr>
+          <w:p>
+            <w:r>
+              <w:t>Init React + Vite frontend</w:t>
+            </w:r>
+          </w:p>
+        </w:tc>
+        <w:tc>
+          <w:tcPr>
+            <w:tcW w:type="dxa" w:w="2160"/>
+          </w:tcPr>
+          <w:p>
+            <w:r>
+              <w:t>AWONO FABIEN NYADINGA</w:t>
+            </w:r>
+          </w:p>
+        </w:tc>
+        <w:tc>
+          <w:tcPr>
+            <w:tcW w:type="dxa" w:w="2160"/>
+          </w:tcPr>
+          <w:p>
+            <w:r>
+              <w:t>Done</w:t>
+            </w:r>
+          </w:p>
+        </w:tc>
+      </w:tr>
+      <w:tr>
+        <w:tc>
+          <w:tcPr>
+            <w:tcW w:type="dxa" w:w="2160"/>
+          </w:tcPr>
+          <w:p>
+            <w:r>
+              <w:t>TKT-103</w:t>
+            </w:r>
+          </w:p>
+        </w:tc>
+        <w:tc>
+          <w:tcPr>
+            <w:tcW w:type="dxa" w:w="2160"/>
+          </w:tcPr>
+          <w:p>
+            <w:r>
+              <w:t>Design Sequelize DB Schema</w:t>
+            </w:r>
+          </w:p>
+        </w:tc>
+        <w:tc>
+          <w:tcPr>
+            <w:tcW w:type="dxa" w:w="2160"/>
+          </w:tcPr>
+          <w:p>
+            <w:r>
+              <w:t>EBUA KEDZE FRANCK JORDAN</w:t>
+            </w:r>
+          </w:p>
+        </w:tc>
+        <w:tc>
+          <w:tcPr>
+            <w:tcW w:type="dxa" w:w="2160"/>
+          </w:tcPr>
+          <w:p>
+            <w:r>
+              <w:t>Done</w:t>
+            </w:r>
+          </w:p>
+        </w:tc>
+      </w:tr>
+      <w:tr>
+        <w:tc>
+          <w:tcPr>
+            <w:tcW w:type="dxa" w:w="2160"/>
+          </w:tcPr>
+          <w:p>
+            <w:r>
+              <w:t>TKT-104</w:t>
+            </w:r>
+          </w:p>
+        </w:tc>
+        <w:tc>
+          <w:tcPr>
+            <w:tcW w:type="dxa" w:w="2160"/>
+          </w:tcPr>
+          <w:p>
+            <w:r>
+              <w:t>Build Auth API (Login/Register)</w:t>
+            </w:r>
+          </w:p>
+        </w:tc>
+        <w:tc>
+          <w:tcPr>
+            <w:tcW w:type="dxa" w:w="2160"/>
+          </w:tcPr>
+          <w:p>
+            <w:r>
+              <w:t>EBUA KEDZE FRANCK JORDAN</w:t>
+            </w:r>
+          </w:p>
+        </w:tc>
+        <w:tc>
+          <w:tcPr>
+            <w:tcW w:type="dxa" w:w="2160"/>
+          </w:tcPr>
+          <w:p>
+            <w:r>
+              <w:t>Done</w:t>
+            </w:r>
+          </w:p>
+        </w:tc>
+      </w:tr>
+      <w:tr>
+        <w:tc>
+          <w:tcPr>
+            <w:tcW w:type="dxa" w:w="2160"/>
+          </w:tcPr>
+          <w:p>
+            <w:r>
+              <w:t>TKT-105</w:t>
+            </w:r>
+          </w:p>
+        </w:tc>
+        <w:tc>
+          <w:tcPr>
+            <w:tcW w:type="dxa" w:w="2160"/>
+          </w:tcPr>
+          <w:p>
+            <w:r>
+              <w:t>Build Auth UI (Login Form)</w:t>
+            </w:r>
+          </w:p>
+        </w:tc>
+        <w:tc>
+          <w:tcPr>
+            <w:tcW w:type="dxa" w:w="2160"/>
+          </w:tcPr>
+          <w:p>
+            <w:r>
+              <w:t>AWONO FABIEN NYADINGA</w:t>
+            </w:r>
+          </w:p>
+        </w:tc>
+        <w:tc>
+          <w:tcPr>
+            <w:tcW w:type="dxa" w:w="2160"/>
+          </w:tcPr>
+          <w:p>
+            <w:r>
+              <w:t>Done</w:t>
+            </w:r>
+          </w:p>
+        </w:tc>
+      </w:tr>
+    </w:tbl>
+    <w:p/>
+    <w:p>
+      <w:pPr>
+        <w:pStyle w:val="Titre3"/>
+      </w:pPr>
+      <w:r>
+        <w:t>QA Test Case Matrix</w:t>
+      </w:r>
+    </w:p>
+    <w:tbl>
+      <w:tblPr>
+        <w:tblStyle w:val="Grilledutableau"/>
+        <w:tblW w:type="auto" w:w="0"/>
+        <w:tblLook w:firstColumn="1" w:firstRow="1" w:lastColumn="0" w:lastRow="0" w:noHBand="0" w:noVBand="1" w:val="04A0"/>
+      </w:tblPr>
+      <w:tblGrid>
+        <w:gridCol w:w="2160"/>
+        <w:gridCol w:w="2160"/>
+        <w:gridCol w:w="2160"/>
+        <w:gridCol w:w="2160"/>
+      </w:tblGrid>
+      <w:tr>
+        <w:tc>
+          <w:tcPr>
+            <w:tcW w:type="dxa" w:w="2160"/>
+          </w:tcPr>
+          <w:p>
+            <w:r>
+              <w:t>Test ID</w:t>
+            </w:r>
+          </w:p>
+        </w:tc>
+        <w:tc>
+          <w:tcPr>
+            <w:tcW w:type="dxa" w:w="2160"/>
+          </w:tcPr>
+          <w:p>
+            <w:r>
+              <w:t>Scenario</w:t>
+            </w:r>
+          </w:p>
+        </w:tc>
+        <w:tc>
+          <w:tcPr>
+            <w:tcW w:type="dxa" w:w="2160"/>
+          </w:tcPr>
+          <w:p>
+            <w:r>
+              <w:t>Expected Result</w:t>
+            </w:r>
+          </w:p>
+        </w:tc>
+        <w:tc>
+          <w:tcPr>
+            <w:tcW w:type="dxa" w:w="2160"/>
+          </w:tcPr>
+          <w:p>
+            <w:r>
+              <w:t>Status</w:t>
+            </w:r>
+          </w:p>
+        </w:tc>
+      </w:tr>
+      <w:tr>
+        <w:tc>
+          <w:tcPr>
+            <w:tcW w:type="dxa" w:w="2160"/>
+          </w:tcPr>
+          <w:p>
+            <w:r>
+              <w:t>TC-01</w:t>
+            </w:r>
+          </w:p>
+        </w:tc>
+        <w:tc>
+          <w:tcPr>
+            <w:tcW w:type="dxa" w:w="2160"/>
+          </w:tcPr>
+          <w:p>
+            <w:r>
+              <w:t>Valid Login</w:t>
+            </w:r>
+          </w:p>
+        </w:tc>
+        <w:tc>
+          <w:tcPr>
+            <w:tcW w:type="dxa" w:w="2160"/>
+          </w:tcPr>
+          <w:p>
+            <w:r>
+              <w:t>JWT Token Returned</w:t>
+            </w:r>
+          </w:p>
+        </w:tc>
+        <w:tc>
+          <w:tcPr>
+            <w:tcW w:type="dxa" w:w="2160"/>
+          </w:tcPr>
+          <w:p>
+            <w:r>
+              <w:t>PASSED</w:t>
+            </w:r>
+          </w:p>
+        </w:tc>
+      </w:tr>
+      <w:tr>
+        <w:tc>
+          <w:tcPr>
+            <w:tcW w:type="dxa" w:w="2160"/>
+          </w:tcPr>
+          <w:p>
+            <w:r>
+              <w:t>TC-02</w:t>
+            </w:r>
+          </w:p>
+        </w:tc>
+        <w:tc>
+          <w:tcPr>
+            <w:tcW w:type="dxa" w:w="2160"/>
+          </w:tcPr>
+          <w:p>
+            <w:r>
+              <w:t>Invalid Password</w:t>
+            </w:r>
+          </w:p>
+        </w:tc>
+        <w:tc>
+          <w:tcPr>
+            <w:tcW w:type="dxa" w:w="2160"/>
+          </w:tcPr>
+          <w:p>
+            <w:r>
+              <w:t>401 Unauthorized</w:t>
+            </w:r>
+          </w:p>
+        </w:tc>
+        <w:tc>
+          <w:tcPr>
+            <w:tcW w:type="dxa" w:w="2160"/>
+          </w:tcPr>
+          <w:p>
+            <w:r>
+              <w:t>PASSED</w:t>
+            </w:r>
+          </w:p>
+        </w:tc>
+      </w:tr>
+      <w:tr>
+        <w:tc>
+          <w:tcPr>
+            <w:tcW w:type="dxa" w:w="2160"/>
+          </w:tcPr>
+          <w:p>
+            <w:r>
+              <w:t>TC-03</w:t>
+            </w:r>
+          </w:p>
+        </w:tc>
+        <w:tc>
+          <w:tcPr>
+            <w:tcW w:type="dxa" w:w="2160"/>
+          </w:tcPr>
+          <w:p>
+            <w:r>
+              <w:t>Create Booking w/o Funds</w:t>
+            </w:r>
+          </w:p>
+        </w:tc>
+        <w:tc>
+          <w:tcPr>
+            <w:tcW w:type="dxa" w:w="2160"/>
+          </w:tcPr>
+          <w:p>
+            <w:r>
+              <w:t>400 Insufficient Funds</w:t>
+            </w:r>
+          </w:p>
+        </w:tc>
+        <w:tc>
+          <w:tcPr>
+            <w:tcW w:type="dxa" w:w="2160"/>
+          </w:tcPr>
+          <w:p>
+            <w:r>
+              <w:t>PASSED</w:t>
+            </w:r>
+          </w:p>
+        </w:tc>
+      </w:tr>
+      <w:tr>
+        <w:tc>
+          <w:tcPr>
+            <w:tcW w:type="dxa" w:w="2160"/>
+          </w:tcPr>
+          <w:p>
+            <w:r>
+              <w:t>TC-04</w:t>
+            </w:r>
+          </w:p>
+        </w:tc>
+        <w:tc>
+          <w:tcPr>
+            <w:tcW w:type="dxa" w:w="2160"/>
+          </w:tcPr>
+          <w:p>
+            <w:r>
+              <w:t>Cancel Pending Booking</w:t>
+            </w:r>
+          </w:p>
+        </w:tc>
+        <w:tc>
+          <w:tcPr>
+            <w:tcW w:type="dxa" w:w="2160"/>
+          </w:tcPr>
+          <w:p>
+            <w:r>
+              <w:t>Escrow Refunded to Client</w:t>
+            </w:r>
+          </w:p>
+        </w:tc>
+        <w:tc>
+          <w:tcPr>
+            <w:tcW w:type="dxa" w:w="2160"/>
+          </w:tcPr>
+          <w:p>
+            <w:r>
+              <w:t>PASSED</w:t>
+            </w:r>
+          </w:p>
+        </w:tc>
+      </w:tr>
+      <w:tr>
+        <w:tc>
+          <w:tcPr>
+            <w:tcW w:type="dxa" w:w="2160"/>
+          </w:tcPr>
+          <w:p>
+            <w:r>
+              <w:t>TC-05</w:t>
+            </w:r>
+          </w:p>
+        </w:tc>
+        <w:tc>
+          <w:tcPr>
+            <w:tcW w:type="dxa" w:w="2160"/>
+          </w:tcPr>
+          <w:p>
+            <w:r>
+              <w:t>Provider Search Filter</w:t>
+            </w:r>
+          </w:p>
+        </w:tc>
+        <w:tc>
+          <w:tcPr>
+            <w:tcW w:type="dxa" w:w="2160"/>
+          </w:tcPr>
+          <w:p>
+            <w:r>
+              <w:t>Only Verified Providers Shown</w:t>
+            </w:r>
+          </w:p>
+        </w:tc>
+        <w:tc>
+          <w:tcPr>
+            <w:tcW w:type="dxa" w:w="2160"/>
+          </w:tcPr>
+          <w:p>
+            <w:r>
+              <w:t>PASSED</w:t>
+            </w:r>
+          </w:p>
+        </w:tc>
+      </w:tr>
+    </w:tbl>
     <w:p>
       <w:pPr>
         <w:pStyle w:val="Titre2"/>
@@ -1161,16 +1707,14 @@
         <w:t>Results and API Testing</w:t>
       </w:r>
     </w:p>
-    <w:p>
-      <w:r>
-        <w:t>[PLACEHOLDER: Insert Screenshots of various API Request/Response from Postman here]</w:t>
-      </w:r>
-    </w:p>
+    <w:p/>
+    <w:p/>
     <w:p>
       <w:pPr>
         <w:pStyle w:val="Titre1"/>
       </w:pPr>
       <w:r>
+        <w:lastRenderedPageBreak/>
         <w:t>Chapter 4: Recommendations and Conclusion</w:t>
       </w:r>
     </w:p>
@@ -1221,7 +1765,6 @@
         <w:pStyle w:val="Titre2"/>
       </w:pPr>
       <w:r>
-        <w:lastRenderedPageBreak/>
         <w:t>4.3 Future Recommendations</w:t>
       </w:r>
     </w:p>

</xml_diff>